<commit_message>
Fix: Sync sheetService fields with Google Sheet and fix ID mapping
</commit_message>
<xml_diff>
--- a/1-Final/操作流程.docx
+++ b/1-Final/操作流程.docx
@@ -8205,29 +8205,21 @@
       </w:r>
       <w:r>
         <w:rPr>
-          <w:rFonts w:hint="eastAsia"/>
-          <w:b/>
-          <w:bCs/>
-          <w:lang w:eastAsia="zh-HK"/>
-        </w:rPr>
-        <w:t>買家</w:t>
-      </w:r>
-      <w:r>
-        <w:rPr>
-          <w:rFonts w:hint="eastAsia"/>
-          <w:b/>
-          <w:bCs/>
-          <w:lang w:eastAsia="zh-HK"/>
-        </w:rPr>
-        <w:t>:</w:t>
-      </w:r>
-    </w:p>
-    <w:p>
-      <w:pPr>
-        <w:rPr>
-          <w:b/>
-        </w:rPr>
-      </w:pPr>
+          <w:b/>
+          <w:bCs/>
+          <w:lang w:eastAsia="zh-HK"/>
+        </w:rPr>
+        <w:t xml:space="preserve">buyer-orders </w:t>
+      </w:r>
+    </w:p>
+    <w:p>
+      <w:pPr>
+        <w:rPr>
+          <w:b/>
+        </w:rPr>
+      </w:pPr>
+      <w:bookmarkStart w:id="0" w:name="_GoBack"/>
+      <w:bookmarkEnd w:id="0"/>
       <w:r>
         <w:rPr>
           <w:b/>
@@ -8303,21 +8295,11 @@
       </w:r>
       <w:r>
         <w:rPr>
-          <w:rFonts w:hint="eastAsia"/>
-          <w:b/>
-          <w:bCs/>
-          <w:lang w:eastAsia="zh-HK"/>
-        </w:rPr>
-        <w:t>版主</w:t>
-      </w:r>
-      <w:r>
-        <w:rPr>
-          <w:rFonts w:hint="eastAsia"/>
-          <w:b/>
-          <w:bCs/>
-          <w:lang w:eastAsia="zh-HK"/>
-        </w:rPr>
-        <w:t>:</w:t>
+          <w:b/>
+          <w:bCs/>
+          <w:lang w:eastAsia="zh-HK"/>
+        </w:rPr>
+        <w:t>admin-product</w:t>
       </w:r>
     </w:p>
     <w:p>
@@ -8389,20 +8371,15 @@
         <w:t>)</w:t>
       </w:r>
       <w:r>
-        <w:rPr>
-          <w:rFonts w:hint="eastAsia"/>
-          <w:b/>
-          <w:bCs/>
-          <w:lang w:eastAsia="zh-HK"/>
-        </w:rPr>
-        <w:t>買家</w:t>
-      </w:r>
-      <w:r>
-        <w:rPr>
-          <w:b/>
-          <w:bCs/>
-        </w:rPr>
-        <w:t>.html</w:t>
+        <w:t xml:space="preserve"> </w:t>
+      </w:r>
+      <w:r>
+        <w:rPr>
+          <w:b/>
+          <w:bCs/>
+          <w:lang w:eastAsia="zh-HK"/>
+        </w:rPr>
+        <w:t>liff-order</w:t>
       </w:r>
     </w:p>
     <w:p>
@@ -8605,20 +8582,10 @@
       </w:r>
       <w:r>
         <w:rPr>
-          <w:rFonts w:hint="eastAsia"/>
-          <w:b/>
-          <w:bCs/>
-        </w:rPr>
-        <w:t>到貨</w:t>
-      </w:r>
-      <w:r>
-        <w:rPr>
-          <w:rFonts w:hint="eastAsia"/>
-          <w:b/>
-          <w:bCs/>
-          <w:lang w:eastAsia="zh-HK"/>
-        </w:rPr>
-        <w:t>標記</w:t>
+          <w:b/>
+          <w:bCs/>
+        </w:rPr>
+        <w:t>admin-arrival</w:t>
       </w:r>
     </w:p>
     <w:p>
@@ -8712,11 +8679,10 @@
       </w:r>
       <w:r>
         <w:rPr>
-          <w:rFonts w:hint="eastAsia"/>
-          <w:b/>
-          <w:bCs/>
-        </w:rPr>
-        <w:t>溢多商品購買區</w:t>
+          <w:b/>
+          <w:bCs/>
+        </w:rPr>
+        <w:t>overstock</w:t>
       </w:r>
     </w:p>
     <w:p>
@@ -8792,15 +8758,15 @@
           <w:bCs/>
           <w:lang w:eastAsia="zh-HK"/>
         </w:rPr>
-        <w:t>我的</w:t>
-      </w:r>
-      <w:r>
-        <w:rPr>
-          <w:rFonts w:hint="eastAsia"/>
-          <w:b/>
-          <w:bCs/>
-        </w:rPr>
-        <w:t>商品詳細</w:t>
+        <w:t>A</w:t>
+      </w:r>
+      <w:r>
+        <w:rPr>
+          <w:b/>
+          <w:bCs/>
+          <w:lang w:eastAsia="zh-HK"/>
+        </w:rPr>
+        <w:t>dmin-orders</w:t>
       </w:r>
     </w:p>
     <w:p>
@@ -8875,7 +8841,7 @@
           <w:b/>
           <w:bCs/>
         </w:rPr>
-        <w:t>現貨清倉統計</w:t>
+        <w:t>Vendor</w:t>
       </w:r>
     </w:p>
     <w:p>
@@ -8952,7 +8918,15 @@
           <w:bCs/>
           <w:lang w:eastAsia="zh-HK"/>
         </w:rPr>
-        <w:t>設定</w:t>
+        <w:t>S</w:t>
+      </w:r>
+      <w:r>
+        <w:rPr>
+          <w:b/>
+          <w:bCs/>
+          <w:lang w:eastAsia="zh-HK"/>
+        </w:rPr>
+        <w:t>etting</w:t>
       </w:r>
     </w:p>
     <w:p>
@@ -9009,8 +8983,6 @@
           <w:bCs/>
         </w:rPr>
       </w:pPr>
-      <w:bookmarkStart w:id="0" w:name="_GoBack"/>
-      <w:bookmarkEnd w:id="0"/>
     </w:p>
     <w:p>
       <w:pPr>
@@ -15165,7 +15137,6 @@
   <w:style w:type="character" w:default="1" w:styleId="a0">
     <w:name w:val="Default Paragraph Font"/>
     <w:uiPriority w:val="1"/>
-    <w:semiHidden/>
     <w:unhideWhenUsed/>
   </w:style>
   <w:style w:type="table" w:default="1" w:styleId="a1">
@@ -15551,7 +15522,7 @@
 </file>
 
 <file path=customXml/itemProps1.xml><?xml version="1.0" encoding="utf-8"?>
-<ds:datastoreItem xmlns:ds="http://schemas.openxmlformats.org/officeDocument/2006/customXml" ds:itemID="{E21B1BE3-32A0-4F41-99E5-598CB4F0030E}">
+<ds:datastoreItem xmlns:ds="http://schemas.openxmlformats.org/officeDocument/2006/customXml" ds:itemID="{6E24325B-18E4-4C6F-BAB8-A23119226432}">
   <ds:schemaRefs>
     <ds:schemaRef ds:uri="http://schemas.openxmlformats.org/officeDocument/2006/bibliography"/>
   </ds:schemaRefs>

</xml_diff>

<commit_message>
Fix: Complete sheetService.js with partial arrival split logic
</commit_message>
<xml_diff>
--- a/1-Final/操作流程.docx
+++ b/1-Final/操作流程.docx
@@ -8218,8 +8218,6 @@
           <w:b/>
         </w:rPr>
       </w:pPr>
-      <w:bookmarkStart w:id="0" w:name="_GoBack"/>
-      <w:bookmarkEnd w:id="0"/>
       <w:r>
         <w:rPr>
           <w:b/>
@@ -8983,15 +8981,159 @@
           <w:bCs/>
         </w:rPr>
       </w:pPr>
-    </w:p>
-    <w:p>
-      <w:pPr>
-        <w:widowControl/>
-        <w:rPr>
-          <w:b/>
-          <w:bCs/>
-        </w:rPr>
-      </w:pPr>
+      <w:r>
+        <w:rPr>
+          <w:rFonts w:hint="eastAsia"/>
+          <w:b/>
+          <w:bCs/>
+        </w:rPr>
+        <w:t>10</w:t>
+      </w:r>
+      <w:r>
+        <w:rPr>
+          <w:b/>
+          <w:bCs/>
+        </w:rPr>
+        <w:t>)</w:t>
+      </w:r>
+      <w:r>
+        <w:t xml:space="preserve"> </w:t>
+      </w:r>
+      <w:r>
+        <w:rPr>
+          <w:b/>
+          <w:bCs/>
+        </w:rPr>
+        <w:t>admin-add-product</w:t>
+      </w:r>
+    </w:p>
+    <w:p>
+      <w:pPr>
+        <w:rPr>
+          <w:b/>
+          <w:bCs/>
+        </w:rPr>
+      </w:pPr>
+      <w:r>
+        <w:rPr>
+          <w:b/>
+          <w:bCs/>
+        </w:rPr>
+        <w:t>LIFF ID:</w:t>
+      </w:r>
+      <w:r>
+        <w:t xml:space="preserve"> </w:t>
+      </w:r>
+      <w:r>
+        <w:rPr>
+          <w:b/>
+          <w:bCs/>
+        </w:rPr>
+        <w:t>2008857998-ZNTmhd33</w:t>
+      </w:r>
+    </w:p>
+    <w:p>
+      <w:pPr>
+        <w:rPr>
+          <w:b/>
+          <w:bCs/>
+        </w:rPr>
+      </w:pPr>
+      <w:r>
+        <w:rPr>
+          <w:b/>
+          <w:bCs/>
+        </w:rPr>
+        <w:t xml:space="preserve">Endpoint URL: </w:t>
+      </w:r>
+      <w:hyperlink r:id="rId19" w:history="1">
+        <w:r>
+          <w:rPr>
+            <w:rStyle w:val="a3"/>
+            <w:b/>
+            <w:bCs/>
+          </w:rPr>
+          <w:t>https://line-group-buy-bot-api.onrender.com/liff/liff-admin-add-product.html</w:t>
+        </w:r>
+      </w:hyperlink>
+    </w:p>
+    <w:p>
+      <w:pPr>
+        <w:rPr>
+          <w:b/>
+          <w:bCs/>
+        </w:rPr>
+      </w:pPr>
+      <w:r>
+        <w:rPr>
+          <w:b/>
+          <w:bCs/>
+        </w:rPr>
+        <w:t>11)</w:t>
+      </w:r>
+      <w:r>
+        <w:t xml:space="preserve"> </w:t>
+      </w:r>
+      <w:r>
+        <w:rPr>
+          <w:b/>
+          <w:bCs/>
+        </w:rPr>
+        <w:t>liff-admin-dispatch.html</w:t>
+      </w:r>
+    </w:p>
+    <w:p>
+      <w:pPr>
+        <w:rPr>
+          <w:b/>
+          <w:bCs/>
+        </w:rPr>
+      </w:pPr>
+      <w:r>
+        <w:rPr>
+          <w:b/>
+          <w:bCs/>
+        </w:rPr>
+        <w:t xml:space="preserve">LIFF ID: </w:t>
+      </w:r>
+      <w:r>
+        <w:rPr>
+          <w:b/>
+          <w:bCs/>
+        </w:rPr>
+        <w:t>2008857998-qCQWSTKf</w:t>
+      </w:r>
+    </w:p>
+    <w:p>
+      <w:pPr>
+        <w:rPr>
+          <w:b/>
+          <w:bCs/>
+        </w:rPr>
+      </w:pPr>
+      <w:r>
+        <w:rPr>
+          <w:b/>
+          <w:bCs/>
+        </w:rPr>
+        <w:t>Endpoint URL: https://line-group-buy-bot-api.onrender.com/liff/</w:t>
+      </w:r>
+      <w:bookmarkStart w:id="0" w:name="_GoBack"/>
+      <w:r>
+        <w:rPr>
+          <w:b/>
+          <w:bCs/>
+        </w:rPr>
+        <w:t>liff-admin-dispatch.</w:t>
+      </w:r>
+      <w:bookmarkEnd w:id="0"/>
+      <w:r>
+        <w:rPr>
+          <w:b/>
+          <w:bCs/>
+        </w:rPr>
+        <w:t xml:space="preserve">html </w:t>
+      </w:r>
       <w:r>
         <w:rPr>
           <w:b/>
@@ -15522,7 +15664,7 @@
 </file>
 
 <file path=customXml/itemProps1.xml><?xml version="1.0" encoding="utf-8"?>
-<ds:datastoreItem xmlns:ds="http://schemas.openxmlformats.org/officeDocument/2006/customXml" ds:itemID="{6E24325B-18E4-4C6F-BAB8-A23119226432}">
+<ds:datastoreItem xmlns:ds="http://schemas.openxmlformats.org/officeDocument/2006/customXml" ds:itemID="{A8D73380-0D62-4D3C-9B42-8B33647E12F4}">
   <ds:schemaRefs>
     <ds:schemaRef ds:uri="http://schemas.openxmlformats.org/officeDocument/2006/bibliography"/>
   </ds:schemaRefs>

</xml_diff>

<commit_message>
Final: Universal sheetService for full business logic
</commit_message>
<xml_diff>
--- a/1-Final/操作流程.docx
+++ b/1-Final/操作流程.docx
@@ -100,7 +100,6 @@
     <w:p>
       <w:pPr>
         <w:rPr>
-          <w:rFonts w:hint="eastAsia"/>
           <w:b/>
           <w:bCs/>
         </w:rPr>
@@ -469,7 +468,6 @@
       <w:pPr>
         <w:ind w:left="1440"/>
         <w:rPr>
-          <w:rFonts w:hint="eastAsia"/>
           <w:b/>
           <w:bCs/>
         </w:rPr>
@@ -839,7 +837,6 @@
     <w:p>
       <w:pPr>
         <w:rPr>
-          <w:rFonts w:hint="eastAsia"/>
           <w:b/>
           <w:bCs/>
         </w:rPr>
@@ -1826,7 +1823,6 @@
     <w:p>
       <w:pPr>
         <w:rPr>
-          <w:rFonts w:hint="eastAsia"/>
           <w:b/>
           <w:bCs/>
           <w:color w:val="0070C0"/>
@@ -2248,9 +2244,6 @@
     <w:p>
       <w:pPr>
         <w:ind w:left="720"/>
-        <w:rPr>
-          <w:rFonts w:hint="eastAsia"/>
-        </w:rPr>
       </w:pPr>
       <w:r>
         <w:rPr>
@@ -2695,7 +2688,6 @@
       <w:pPr>
         <w:ind w:left="1440"/>
         <w:rPr>
-          <w:rFonts w:hint="eastAsia"/>
           <w:b/>
           <w:bCs/>
           <w:lang w:eastAsia="zh-HK"/>
@@ -2888,7 +2880,6 @@
         </w:numPr>
         <w:ind w:leftChars="0"/>
         <w:rPr>
-          <w:rFonts w:hint="eastAsia"/>
           <w:b/>
           <w:bCs/>
         </w:rPr>
@@ -2944,7 +2935,6 @@
         </w:tabs>
         <w:ind w:firstLineChars="172" w:firstLine="413"/>
         <w:rPr>
-          <w:rFonts w:hint="eastAsia"/>
           <w:b/>
           <w:bCs/>
         </w:rPr>
@@ -3991,7 +3981,6 @@
       <w:pPr>
         <w:ind w:firstLineChars="200" w:firstLine="480"/>
         <w:rPr>
-          <w:rFonts w:hint="eastAsia"/>
           <w:b/>
           <w:bCs/>
         </w:rPr>
@@ -4206,7 +4195,6 @@
       <w:pPr>
         <w:ind w:firstLineChars="200" w:firstLine="480"/>
         <w:rPr>
-          <w:rFonts w:hint="eastAsia"/>
           <w:lang w:eastAsia="zh-HK"/>
         </w:rPr>
       </w:pPr>
@@ -4232,8 +4220,6 @@
           <w:bCs/>
         </w:rPr>
       </w:pPr>
-      <w:bookmarkStart w:id="0" w:name="_GoBack"/>
-      <w:bookmarkEnd w:id="0"/>
     </w:p>
     <w:p>
       <w:pPr>
@@ -5891,6 +5877,91 @@
           <w:bCs/>
         </w:rPr>
         <w:t xml:space="preserve">Endpoint URL: https://line-group-buy-bot-api.onrender.com/liff/liff-admin-dispatch.html </w:t>
+      </w:r>
+    </w:p>
+    <w:p>
+      <w:pPr>
+        <w:rPr>
+          <w:b/>
+          <w:bCs/>
+        </w:rPr>
+      </w:pPr>
+      <w:r>
+        <w:rPr>
+          <w:b/>
+          <w:bCs/>
+        </w:rPr>
+        <w:t>12)</w:t>
+      </w:r>
+      <w:r>
+        <w:t xml:space="preserve"> </w:t>
+      </w:r>
+      <w:r>
+        <w:rPr>
+          <w:b/>
+          <w:bCs/>
+        </w:rPr>
+        <w:t>liff-admin-vendor</w:t>
+      </w:r>
+      <w:r>
+        <w:rPr>
+          <w:b/>
+          <w:bCs/>
+        </w:rPr>
+        <w:t>.html</w:t>
+      </w:r>
+    </w:p>
+    <w:p>
+      <w:pPr>
+        <w:rPr>
+          <w:b/>
+          <w:bCs/>
+        </w:rPr>
+      </w:pPr>
+      <w:r>
+        <w:rPr>
+          <w:b/>
+          <w:bCs/>
+        </w:rPr>
+        <w:t xml:space="preserve">LIFF ID: </w:t>
+      </w:r>
+      <w:r>
+        <w:rPr>
+          <w:b/>
+          <w:bCs/>
+        </w:rPr>
+        <w:t>2008857998-qOI2DqCC</w:t>
+      </w:r>
+      <w:bookmarkStart w:id="0" w:name="_GoBack"/>
+      <w:bookmarkEnd w:id="0"/>
+    </w:p>
+    <w:p>
+      <w:pPr>
+        <w:rPr>
+          <w:b/>
+          <w:bCs/>
+        </w:rPr>
+      </w:pPr>
+      <w:r>
+        <w:rPr>
+          <w:b/>
+          <w:bCs/>
+        </w:rPr>
+        <w:t>Endpoint URL: https://line-group</w:t>
+      </w:r>
+      <w:r>
+        <w:rPr>
+          <w:b/>
+          <w:bCs/>
+        </w:rPr>
+        <w:t>-buy-bot-api.onrender.com/liff/</w:t>
+      </w:r>
+      <w:r>
+        <w:rPr>
+          <w:b/>
+          <w:bCs/>
+        </w:rPr>
+        <w:t xml:space="preserve">liff-admin-vendor.html </w:t>
       </w:r>
       <w:r>
         <w:rPr>
@@ -12835,7 +12906,7 @@
 </file>
 
 <file path=customXml/itemProps1.xml><?xml version="1.0" encoding="utf-8"?>
-<ds:datastoreItem xmlns:ds="http://schemas.openxmlformats.org/officeDocument/2006/customXml" ds:itemID="{21A7E987-F8C0-4770-9D0E-1A5016EC4F42}">
+<ds:datastoreItem xmlns:ds="http://schemas.openxmlformats.org/officeDocument/2006/customXml" ds:itemID="{8DB10564-1964-4276-9658-29AAAE64C603}">
   <ds:schemaRefs>
     <ds:schemaRef ds:uri="http://schemas.openxmlformats.org/officeDocument/2006/bibliography"/>
   </ds:schemaRefs>

</xml_diff>

<commit_message>
Update service layers for e-commerce features
</commit_message>
<xml_diff>
--- a/1-Final/操作流程.docx
+++ b/1-Final/操作流程.docx
@@ -5901,39 +5901,46 @@
           <w:b/>
           <w:bCs/>
         </w:rPr>
-        <w:t>liff-admin-vendor</w:t>
-      </w:r>
-      <w:r>
-        <w:rPr>
-          <w:b/>
-          <w:bCs/>
-        </w:rPr>
-        <w:t>.html</w:t>
-      </w:r>
-    </w:p>
-    <w:p>
-      <w:pPr>
-        <w:rPr>
-          <w:b/>
-          <w:bCs/>
-        </w:rPr>
-      </w:pPr>
-      <w:r>
-        <w:rPr>
-          <w:b/>
-          <w:bCs/>
-        </w:rPr>
-        <w:t xml:space="preserve">LIFF ID: </w:t>
-      </w:r>
-      <w:r>
-        <w:rPr>
-          <w:b/>
-          <w:bCs/>
-        </w:rPr>
-        <w:t>2008857998-qOI2DqCC</w:t>
+        <w:t>product-detail</w:t>
+      </w:r>
+      <w:r>
+        <w:rPr>
+          <w:b/>
+          <w:bCs/>
+        </w:rPr>
+        <w:t>.</w:t>
       </w:r>
       <w:bookmarkStart w:id="0" w:name="_GoBack"/>
       <w:bookmarkEnd w:id="0"/>
+      <w:r>
+        <w:rPr>
+          <w:b/>
+          <w:bCs/>
+        </w:rPr>
+        <w:t>html</w:t>
+      </w:r>
+    </w:p>
+    <w:p>
+      <w:pPr>
+        <w:rPr>
+          <w:b/>
+          <w:bCs/>
+        </w:rPr>
+      </w:pPr>
+      <w:r>
+        <w:rPr>
+          <w:b/>
+          <w:bCs/>
+        </w:rPr>
+        <w:t xml:space="preserve">LIFF ID: </w:t>
+      </w:r>
+      <w:r>
+        <w:rPr>
+          <w:b/>
+          <w:bCs/>
+        </w:rPr>
+        <w:t>2008857998-qOI2DqCC</w:t>
+      </w:r>
     </w:p>
     <w:p>
       <w:pPr>
@@ -5961,7 +5968,21 @@
           <w:b/>
           <w:bCs/>
         </w:rPr>
-        <w:t xml:space="preserve">liff-admin-vendor.html </w:t>
+        <w:t>product-detail</w:t>
+      </w:r>
+      <w:r>
+        <w:rPr>
+          <w:b/>
+          <w:bCs/>
+        </w:rPr>
+        <w:t>.</w:t>
+      </w:r>
+      <w:r>
+        <w:rPr>
+          <w:b/>
+          <w:bCs/>
+        </w:rPr>
+        <w:t xml:space="preserve">html </w:t>
       </w:r>
       <w:r>
         <w:rPr>
@@ -12906,7 +12927,7 @@
 </file>
 
 <file path=customXml/itemProps1.xml><?xml version="1.0" encoding="utf-8"?>
-<ds:datastoreItem xmlns:ds="http://schemas.openxmlformats.org/officeDocument/2006/customXml" ds:itemID="{8DB10564-1964-4276-9658-29AAAE64C603}">
+<ds:datastoreItem xmlns:ds="http://schemas.openxmlformats.org/officeDocument/2006/customXml" ds:itemID="{86ABDF82-45DF-42FC-8FE2-C06E54F01125}">
   <ds:schemaRefs>
     <ds:schemaRef ds:uri="http://schemas.openxmlformats.org/officeDocument/2006/bibliography"/>
   </ds:schemaRefs>

</xml_diff>

<commit_message>
Full Update: index and sheetService with locking logic and consolidated APIs
</commit_message>
<xml_diff>
--- a/1-Final/操作流程.docx
+++ b/1-Final/操作流程.docx
@@ -5876,8 +5876,18 @@
           <w:b/>
           <w:bCs/>
         </w:rPr>
-        <w:t xml:space="preserve">Endpoint URL: https://line-group-buy-bot-api.onrender.com/liff/liff-admin-dispatch.html </w:t>
-      </w:r>
+        <w:t xml:space="preserve">Endpoint URL: </w:t>
+      </w:r>
+      <w:hyperlink r:id="rId20" w:history="1">
+        <w:r>
+          <w:rPr>
+            <w:rStyle w:val="a3"/>
+            <w:b/>
+            <w:bCs/>
+          </w:rPr>
+          <w:t>https://line-group-buy-bot-api.onrender.com/liff/liff-admin-dispatch.html</w:t>
+        </w:r>
+      </w:hyperlink>
     </w:p>
     <w:p>
       <w:pPr>
@@ -5945,164 +5955,146 @@
           <w:b/>
           <w:bCs/>
         </w:rPr>
-        <w:t>Endpoint URL: https://line-group</w:t>
-      </w:r>
-      <w:r>
-        <w:rPr>
-          <w:b/>
-          <w:bCs/>
-        </w:rPr>
-        <w:t>-buy-bot-api.onrender.com/liff/</w:t>
-      </w:r>
-      <w:r>
-        <w:rPr>
-          <w:b/>
-          <w:bCs/>
-        </w:rPr>
-        <w:t>liff-</w:t>
-      </w:r>
-      <w:r>
-        <w:rPr>
-          <w:b/>
-          <w:bCs/>
-        </w:rPr>
-        <w:t>product-detail</w:t>
-      </w:r>
-      <w:r>
-        <w:rPr>
-          <w:b/>
-          <w:bCs/>
-        </w:rPr>
-        <w:t>.</w:t>
-      </w:r>
-      <w:r>
-        <w:rPr>
-          <w:b/>
-          <w:bCs/>
-        </w:rPr>
-        <w:t xml:space="preserve">html </w:t>
-      </w:r>
-      <w:r>
-        <w:rPr>
-          <w:b/>
-          <w:bCs/>
-        </w:rPr>
-        <w:br w:type="page"/>
-      </w:r>
-    </w:p>
-    <w:p>
-      <w:pPr>
-        <w:rPr>
-          <w:b/>
-          <w:bCs/>
-        </w:rPr>
-      </w:pPr>
-    </w:p>
-    <w:p>
-      <w:pPr>
-        <w:rPr>
-          <w:rFonts w:hint="eastAsia"/>
-          <w:b/>
-          <w:bCs/>
-        </w:rPr>
-      </w:pPr>
-      <w:r>
-        <w:rPr>
-          <w:rFonts w:hint="eastAsia"/>
-          <w:b/>
-          <w:bCs/>
-        </w:rPr>
-        <w:t>請執行：</w:t>
-      </w:r>
-    </w:p>
-    <w:p>
-      <w:pPr>
-        <w:rPr>
-          <w:b/>
-          <w:bCs/>
-        </w:rPr>
-      </w:pPr>
-    </w:p>
-    <w:p>
-      <w:pPr>
-        <w:rPr>
-          <w:b/>
-          <w:bCs/>
-        </w:rPr>
-      </w:pPr>
-      <w:r>
-        <w:rPr>
-          <w:b/>
-          <w:bCs/>
-        </w:rPr>
-        <w:t>git add .</w:t>
-      </w:r>
-    </w:p>
-    <w:p>
-      <w:pPr>
-        <w:rPr>
-          <w:b/>
-          <w:bCs/>
-        </w:rPr>
-      </w:pPr>
-    </w:p>
-    <w:p>
-      <w:pPr>
-        <w:rPr>
-          <w:rFonts w:hint="eastAsia"/>
-          <w:b/>
-          <w:bCs/>
-        </w:rPr>
-      </w:pPr>
-      <w:r>
-        <w:rPr>
-          <w:rFonts w:hint="eastAsia"/>
-          <w:b/>
-          <w:bCs/>
-        </w:rPr>
-        <w:t>git commit -m "</w:t>
-      </w:r>
-      <w:r>
-        <w:rPr>
-          <w:rFonts w:hint="eastAsia"/>
-          <w:b/>
-          <w:bCs/>
-        </w:rPr>
-        <w:t>修正下單頁顏色規格拆分邏輯</w:t>
-      </w:r>
-      <w:r>
-        <w:rPr>
-          <w:rFonts w:hint="eastAsia"/>
-          <w:b/>
-          <w:bCs/>
-        </w:rPr>
-        <w:t>"</w:t>
-      </w:r>
-    </w:p>
-    <w:p>
-      <w:pPr>
-        <w:rPr>
-          <w:b/>
-          <w:bCs/>
-        </w:rPr>
-      </w:pPr>
-    </w:p>
-    <w:p>
-      <w:pPr>
-        <w:rPr>
-          <w:b/>
-          <w:bCs/>
-        </w:rPr>
-      </w:pPr>
-      <w:r>
-        <w:rPr>
-          <w:b/>
-          <w:bCs/>
-        </w:rPr>
-        <w:t>git push</w:t>
-      </w:r>
+        <w:t xml:space="preserve">Endpoint URL: </w:t>
+      </w:r>
+      <w:hyperlink r:id="rId21" w:history="1">
+        <w:r>
+          <w:rPr>
+            <w:rStyle w:val="a3"/>
+            <w:b/>
+            <w:bCs/>
+          </w:rPr>
+          <w:t>https://line-group-buy-bot-api.onrender.com/liff/liff-product-detail.html</w:t>
+        </w:r>
+      </w:hyperlink>
+    </w:p>
+    <w:p>
+      <w:pPr>
+        <w:rPr>
+          <w:b/>
+          <w:bCs/>
+        </w:rPr>
+      </w:pPr>
       <w:bookmarkStart w:id="0" w:name="_GoBack"/>
       <w:bookmarkEnd w:id="0"/>
+    </w:p>
+    <w:p>
+      <w:pPr>
+        <w:rPr>
+          <w:b/>
+          <w:bCs/>
+        </w:rPr>
+      </w:pPr>
+    </w:p>
+    <w:p>
+      <w:pPr>
+        <w:rPr>
+          <w:b/>
+          <w:bCs/>
+        </w:rPr>
+      </w:pPr>
+    </w:p>
+    <w:p>
+      <w:pPr>
+        <w:rPr>
+          <w:b/>
+          <w:bCs/>
+        </w:rPr>
+      </w:pPr>
+      <w:r>
+        <w:rPr>
+          <w:rFonts w:hint="eastAsia"/>
+          <w:b/>
+          <w:bCs/>
+        </w:rPr>
+        <w:t>請執行：</w:t>
+      </w:r>
+    </w:p>
+    <w:p>
+      <w:pPr>
+        <w:rPr>
+          <w:b/>
+          <w:bCs/>
+        </w:rPr>
+      </w:pPr>
+    </w:p>
+    <w:p>
+      <w:pPr>
+        <w:rPr>
+          <w:b/>
+          <w:bCs/>
+        </w:rPr>
+      </w:pPr>
+      <w:r>
+        <w:rPr>
+          <w:b/>
+          <w:bCs/>
+        </w:rPr>
+        <w:t>git add .</w:t>
+      </w:r>
+    </w:p>
+    <w:p>
+      <w:pPr>
+        <w:rPr>
+          <w:b/>
+          <w:bCs/>
+        </w:rPr>
+      </w:pPr>
+    </w:p>
+    <w:p>
+      <w:pPr>
+        <w:rPr>
+          <w:b/>
+          <w:bCs/>
+        </w:rPr>
+      </w:pPr>
+      <w:r>
+        <w:rPr>
+          <w:rFonts w:hint="eastAsia"/>
+          <w:b/>
+          <w:bCs/>
+        </w:rPr>
+        <w:t>git commit -m "</w:t>
+      </w:r>
+      <w:r>
+        <w:rPr>
+          <w:rFonts w:hint="eastAsia"/>
+          <w:b/>
+          <w:bCs/>
+        </w:rPr>
+        <w:t>修正下單頁顏色規格拆分邏輯</w:t>
+      </w:r>
+      <w:r>
+        <w:rPr>
+          <w:rFonts w:hint="eastAsia"/>
+          <w:b/>
+          <w:bCs/>
+        </w:rPr>
+        <w:t>"</w:t>
+      </w:r>
+    </w:p>
+    <w:p>
+      <w:pPr>
+        <w:rPr>
+          <w:b/>
+          <w:bCs/>
+        </w:rPr>
+      </w:pPr>
+    </w:p>
+    <w:p>
+      <w:pPr>
+        <w:rPr>
+          <w:b/>
+          <w:bCs/>
+        </w:rPr>
+      </w:pPr>
+      <w:r>
+        <w:rPr>
+          <w:b/>
+          <w:bCs/>
+        </w:rPr>
+        <w:t>git push</w:t>
+      </w:r>
     </w:p>
     <w:p>
       <w:pPr>
@@ -10437,7 +10429,7 @@
 </file>
 
 <file path=customXml/itemProps1.xml><?xml version="1.0" encoding="utf-8"?>
-<ds:datastoreItem xmlns:ds="http://schemas.openxmlformats.org/officeDocument/2006/customXml" ds:itemID="{A3AA4731-BD79-43F1-AE5C-86277A3D1CCD}">
+<ds:datastoreItem xmlns:ds="http://schemas.openxmlformats.org/officeDocument/2006/customXml" ds:itemID="{62ED73BC-2A1C-4BD5-A485-24A695EDF02A}">
   <ds:schemaRefs>
     <ds:schemaRef ds:uri="http://schemas.openxmlformats.org/officeDocument/2006/bibliography"/>
   </ds:schemaRefs>

</xml_diff>

<commit_message>
Fix: Show close date in mall, strict spec validation, and fix admin list loading
</commit_message>
<xml_diff>
--- a/1-Final/操作流程.docx
+++ b/1-Final/操作流程.docx
@@ -5878,86 +5878,134 @@
         </w:rPr>
         <w:t xml:space="preserve">Endpoint URL: </w:t>
       </w:r>
+      <w:bookmarkStart w:id="0" w:name="_GoBack"/>
+      <w:bookmarkEnd w:id="0"/>
+      <w:r>
+        <w:rPr>
+          <w:rStyle w:val="a3"/>
+          <w:b/>
+          <w:bCs/>
+        </w:rPr>
+        <w:fldChar w:fldCharType="begin"/>
+      </w:r>
+      <w:r>
+        <w:rPr>
+          <w:rStyle w:val="a3"/>
+          <w:b/>
+          <w:bCs/>
+        </w:rPr>
+        <w:instrText xml:space="preserve"> HYPERLINK "</w:instrText>
+      </w:r>
+      <w:r>
+        <w:rPr>
+          <w:rStyle w:val="a3"/>
+          <w:b/>
+          <w:bCs/>
+        </w:rPr>
+        <w:instrText xml:space="preserve">https://line-group-buy-bot-api.onrender.com/liff/liff-product-list.html </w:instrText>
+      </w:r>
+      <w:r>
+        <w:rPr>
+          <w:rStyle w:val="a3"/>
+          <w:b/>
+          <w:bCs/>
+        </w:rPr>
+        <w:instrText xml:space="preserve">" </w:instrText>
+      </w:r>
+      <w:r>
+        <w:rPr>
+          <w:rStyle w:val="a3"/>
+          <w:b/>
+          <w:bCs/>
+        </w:rPr>
+        <w:fldChar w:fldCharType="separate"/>
+      </w:r>
+      <w:r>
+        <w:rPr>
+          <w:rStyle w:val="a3"/>
+          <w:b/>
+          <w:bCs/>
+        </w:rPr>
+        <w:t xml:space="preserve">https://line-group-buy-bot-api.onrender.com/liff/liff-product-list.html </w:t>
+      </w:r>
+      <w:r>
+        <w:rPr>
+          <w:rStyle w:val="a3"/>
+          <w:b/>
+          <w:bCs/>
+        </w:rPr>
+        <w:fldChar w:fldCharType="end"/>
+      </w:r>
+    </w:p>
+    <w:p>
+      <w:pPr>
+        <w:rPr>
+          <w:b/>
+          <w:bCs/>
+        </w:rPr>
+      </w:pPr>
+      <w:r>
+        <w:rPr>
+          <w:b/>
+          <w:bCs/>
+        </w:rPr>
+        <w:t>12)</w:t>
+      </w:r>
+      <w:r>
+        <w:t xml:space="preserve"> </w:t>
+      </w:r>
+      <w:r>
+        <w:rPr>
+          <w:b/>
+          <w:bCs/>
+        </w:rPr>
+        <w:t>product-detail</w:t>
+      </w:r>
+      <w:r>
+        <w:rPr>
+          <w:b/>
+          <w:bCs/>
+        </w:rPr>
+        <w:t>.</w:t>
+      </w:r>
+      <w:r>
+        <w:rPr>
+          <w:b/>
+          <w:bCs/>
+        </w:rPr>
+        <w:t>html</w:t>
+      </w:r>
+    </w:p>
+    <w:p>
+      <w:pPr>
+        <w:rPr>
+          <w:b/>
+          <w:bCs/>
+        </w:rPr>
+      </w:pPr>
+      <w:r>
+        <w:rPr>
+          <w:b/>
+          <w:bCs/>
+        </w:rPr>
+        <w:t>LIFF ID: 2008857998-qOI2DqCC</w:t>
+      </w:r>
+    </w:p>
+    <w:p>
+      <w:pPr>
+        <w:rPr>
+          <w:b/>
+          <w:bCs/>
+        </w:rPr>
+      </w:pPr>
+      <w:r>
+        <w:rPr>
+          <w:b/>
+          <w:bCs/>
+        </w:rPr>
+        <w:t xml:space="preserve">Endpoint URL: </w:t>
+      </w:r>
       <w:hyperlink r:id="rId20" w:history="1">
-        <w:r>
-          <w:rPr>
-            <w:rStyle w:val="a3"/>
-            <w:b/>
-            <w:bCs/>
-          </w:rPr>
-          <w:t>https://line-group-buy-bot-api.onrender.com/liff/liff-admin-dispatch.html</w:t>
-        </w:r>
-      </w:hyperlink>
-    </w:p>
-    <w:p>
-      <w:pPr>
-        <w:rPr>
-          <w:b/>
-          <w:bCs/>
-        </w:rPr>
-      </w:pPr>
-      <w:r>
-        <w:rPr>
-          <w:b/>
-          <w:bCs/>
-        </w:rPr>
-        <w:t>12)</w:t>
-      </w:r>
-      <w:r>
-        <w:t xml:space="preserve"> </w:t>
-      </w:r>
-      <w:r>
-        <w:rPr>
-          <w:b/>
-          <w:bCs/>
-        </w:rPr>
-        <w:t>product-detail</w:t>
-      </w:r>
-      <w:r>
-        <w:rPr>
-          <w:b/>
-          <w:bCs/>
-        </w:rPr>
-        <w:t>.</w:t>
-      </w:r>
-      <w:r>
-        <w:rPr>
-          <w:b/>
-          <w:bCs/>
-        </w:rPr>
-        <w:t>html</w:t>
-      </w:r>
-    </w:p>
-    <w:p>
-      <w:pPr>
-        <w:rPr>
-          <w:b/>
-          <w:bCs/>
-        </w:rPr>
-      </w:pPr>
-      <w:r>
-        <w:rPr>
-          <w:b/>
-          <w:bCs/>
-        </w:rPr>
-        <w:t>LIFF ID: 2008857998-qOI2DqCC</w:t>
-      </w:r>
-    </w:p>
-    <w:p>
-      <w:pPr>
-        <w:rPr>
-          <w:b/>
-          <w:bCs/>
-        </w:rPr>
-      </w:pPr>
-      <w:r>
-        <w:rPr>
-          <w:b/>
-          <w:bCs/>
-        </w:rPr>
-        <w:t xml:space="preserve">Endpoint URL: </w:t>
-      </w:r>
-      <w:hyperlink r:id="rId21" w:history="1">
         <w:r>
           <w:rPr>
             <w:rStyle w:val="a3"/>
@@ -5975,8 +6023,6 @@
           <w:bCs/>
         </w:rPr>
       </w:pPr>
-      <w:bookmarkStart w:id="0" w:name="_GoBack"/>
-      <w:bookmarkEnd w:id="0"/>
     </w:p>
     <w:p>
       <w:pPr>
@@ -10043,7 +10089,6 @@
   <w:style w:type="character" w:default="1" w:styleId="a0">
     <w:name w:val="Default Paragraph Font"/>
     <w:uiPriority w:val="1"/>
-    <w:semiHidden/>
     <w:unhideWhenUsed/>
   </w:style>
   <w:style w:type="table" w:default="1" w:styleId="a1">
@@ -10429,7 +10474,7 @@
 </file>
 
 <file path=customXml/itemProps1.xml><?xml version="1.0" encoding="utf-8"?>
-<ds:datastoreItem xmlns:ds="http://schemas.openxmlformats.org/officeDocument/2006/customXml" ds:itemID="{62ED73BC-2A1C-4BD5-A485-24A695EDF02A}">
+<ds:datastoreItem xmlns:ds="http://schemas.openxmlformats.org/officeDocument/2006/customXml" ds:itemID="{BC937EA9-EE38-440B-B85E-604AA2AC8342}">
   <ds:schemaRefs>
     <ds:schemaRef ds:uri="http://schemas.openxmlformats.org/officeDocument/2006/bibliography"/>
   </ds:schemaRefs>

</xml_diff>